<commit_message>
chore: regenerate docx files and update sitemap lastmod
</commit_message>
<xml_diff>
--- a/trip/weihai/weihai.docx
+++ b/trip/weihai/weihai.docx
@@ -597,21 +597,6 @@
     </w:p>
     <w:p>
       <w:pPr>
-        <w:pStyle w:val="ListBullet"/>
-        <w:spacing w:after="60"/>
-        <w:ind w:left="340"/>
-      </w:pPr>
-      <w:r>
-        <w:rPr>
-          <w:rFonts w:ascii="Helvetica Neue" w:hAnsi="Helvetica Neue" w:eastAsia="PingFang SC"/>
-          <w:b w:val="0"/>
-          <w:sz w:val="21"/>
-        </w:rPr>
-        <w:t>☑ 海源公园 (环翠区 / 东 / 3.1km / 9min)</w:t>
-      </w:r>
-    </w:p>
-    <w:p>
-      <w:pPr>
         <w:spacing w:after="80" w:lineRule="auto" w:line="300"/>
       </w:pPr>
       <w:r>
@@ -681,6 +666,21 @@
           <w:sz w:val="21"/>
         </w:rPr>
         <w:t>☑ 猫头山 (环翠区 / 东北 / 9.5km / 25min)</w:t>
+      </w:r>
+    </w:p>
+    <w:p>
+      <w:pPr>
+        <w:pStyle w:val="ListBullet"/>
+        <w:spacing w:after="60"/>
+        <w:ind w:left="340"/>
+      </w:pPr>
+      <w:r>
+        <w:rPr>
+          <w:rFonts w:ascii="Helvetica Neue" w:hAnsi="Helvetica Neue" w:eastAsia="PingFang SC"/>
+          <w:b w:val="0"/>
+          <w:sz w:val="21"/>
+        </w:rPr>
+        <w:t>☑ 海源公园 (环翠区 / 东 / 3.1km / 9min)</w:t>
       </w:r>
     </w:p>
     <w:p>

</xml_diff>

<commit_message>
fix(weihai): correct 9 attraction direction octants based on geocode bearings
</commit_message>
<xml_diff>
--- a/trip/weihai/weihai.docx
+++ b/trip/weihai/weihai.docx
@@ -577,7 +577,7 @@
           <w:b w:val="0"/>
           <w:sz w:val="21"/>
         </w:rPr>
-        <w:t>☐ 金海滩海水浴场 (环翠区 / 西 / 7.0km / 16min)</w:t>
+        <w:t>☐ 金海滩海水浴场 (环翠区 / 西北 / 7.0km / 16min)</w:t>
       </w:r>
     </w:p>
     <w:p>
@@ -620,7 +620,7 @@
           <w:b w:val="0"/>
           <w:sz w:val="21"/>
         </w:rPr>
-        <w:t>☐ 小石岛景区 (环翠区 / 西北 / 11.1km / 27min)</w:t>
+        <w:t>☐ 小石岛景区 (环翠区 / 西 / 11.1km / 27min)</w:t>
       </w:r>
     </w:p>
     <w:p>
@@ -725,7 +725,7 @@
           <w:b w:val="0"/>
           <w:sz w:val="21"/>
         </w:rPr>
-        <w:t>☑ 幸福门 (环翠区 / 南 / 2.6km / 12min)</w:t>
+        <w:t>☑ 幸福门 (环翠区 / 东南 / 2.6km / 12min)</w:t>
       </w:r>
     </w:p>
     <w:p>
@@ -740,7 +740,7 @@
           <w:b w:val="0"/>
           <w:sz w:val="21"/>
         </w:rPr>
-        <w:t>☐ 环翠楼公园 (环翠区 / 中心 / 2.4km / 9min)</w:t>
+        <w:t>☐ 环翠楼公园 (环翠区 / 西南 / 2.4km / 9min)</w:t>
       </w:r>
     </w:p>
     <w:p>
@@ -755,7 +755,7 @@
           <w:b w:val="0"/>
           <w:sz w:val="21"/>
         </w:rPr>
-        <w:t>☑ 栖霞街 (环翠区 / 中心 / 2.6km / 9min)</w:t>
+        <w:t>☑ 栖霞街 (环翠区 / 南 / 2.6km / 9min)</w:t>
       </w:r>
     </w:p>
     <w:p>
@@ -770,7 +770,7 @@
           <w:b w:val="0"/>
           <w:sz w:val="21"/>
         </w:rPr>
-        <w:t>☑ 新威附路 (环翠区 / 中心 / 3.0km / 10min)</w:t>
+        <w:t>☑ 新威附路 (环翠区 / 东南 / 3.0km / 10min)</w:t>
       </w:r>
     </w:p>
     <w:p>
@@ -914,7 +914,7 @@
           <w:b w:val="0"/>
           <w:sz w:val="21"/>
         </w:rPr>
-        <w:t>☐ 那香海景区 (荣成市 / 东北 / 37.9km / 55min)</w:t>
+        <w:t>☐ 那香海景区 (荣成市 / 东南 / 37.9km / 55min)</w:t>
       </w:r>
     </w:p>
     <w:p>
@@ -929,7 +929,7 @@
           <w:b w:val="0"/>
           <w:sz w:val="21"/>
         </w:rPr>
-        <w:t>☐ 鸡鸣岛 (荣成市 / 东北 / 47.5km / 1h29min)</w:t>
+        <w:t>☐ 鸡鸣岛 (荣成市 / 东 / 47.5km / 1h29min)</w:t>
       </w:r>
     </w:p>
     <w:p>
@@ -974,7 +974,7 @@
           <w:b w:val="0"/>
           <w:sz w:val="21"/>
         </w:rPr>
-        <w:t>☐ 烟墩角 (荣成市 / 东 / 60.2km / 1h14min)</w:t>
+        <w:t>☐ 烟墩角 (荣成市 / 东南 / 60.2km / 1h14min)</w:t>
       </w:r>
     </w:p>
     <w:p/>

</xml_diff>

<commit_message>
sync: update Weihai guide with post-trip adjustments (2026-09-11)
</commit_message>
<xml_diff>
--- a/trip/weihai/weihai.docx
+++ b/trip/weihai/weihai.docx
@@ -67,7 +67,7 @@
           <w:b w:val="0"/>
           <w:sz w:val="22"/>
         </w:rPr>
-        <w:t>跨市交通: 飞机。去程 CA9829 杭州 14:40→威海 16:50；返程 CA1788 威海 15:00→杭州 17:00。</w:t>
+        <w:t>跨市交通: 飞机。去程 杭州 14:40→威海 16:50；返程 威海 15:00→杭州 17:00。</w:t>
       </w:r>
     </w:p>
     <w:p>
@@ -127,6 +127,19 @@
     </w:p>
     <w:p>
       <w:pPr>
+        <w:spacing w:after="80" w:lineRule="auto" w:line="300"/>
+      </w:pPr>
+      <w:r>
+        <w:rPr>
+          <w:rFonts w:ascii="Helvetica Neue" w:hAnsi="Helvetica Neue" w:eastAsia="PingFang SC"/>
+          <w:b/>
+          <w:sz w:val="21"/>
+        </w:rPr>
+        <w:t>景点：幸福公园(1小时)</w:t>
+      </w:r>
+    </w:p>
+    <w:p>
+      <w:pPr>
         <w:spacing w:after="120" w:lineRule="auto" w:line="300"/>
       </w:pPr>
       <w:r>
@@ -135,7 +148,7 @@
           <w:b w:val="0"/>
           <w:sz w:val="21"/>
         </w:rPr>
-        <w:t>打车到酒店，不安排游玩。</w:t>
+        <w:t>打车到酒店。晚餐后步行到海边，幸福公园散步。</w:t>
       </w:r>
     </w:p>
     <w:p>
@@ -162,7 +175,7 @@
           <w:b/>
           <w:sz w:val="21"/>
         </w:rPr>
-        <w:t>景点：新威附路(1小时) - 海滨生态公园(1小时) - 幸福门(0.5小时) - 海源公园(2小时) - 栖霞街(1小时)</w:t>
+        <w:t>景点：新威附路(1小时) - 海源公园(2小时) - 半月湾风景区(2小时) - 栖霞街(1小时)</w:t>
       </w:r>
     </w:p>
     <w:p>
@@ -175,7 +188,7 @@
           <w:b w:val="0"/>
           <w:sz w:val="21"/>
         </w:rPr>
-        <w:t>废脚的一天。打车到新威附路，逛到海滨生态公园、幸福门，午餐沿途解决。打车去海源公园玩沙看灯塔。再打车折返栖霞街晚餐，顺带逛逛这个老街区。</w:t>
+        <w:t>废脚的一天。打车到新威附路，午餐沿途解决。逛完打车到海源公园看渔船逛鱼市。再步行到临近的半月湾沙滩玩沙。然后打车折返栖霞街晚餐，逛逛这个老街区和周边闹市区。</w:t>
       </w:r>
     </w:p>
     <w:p>
@@ -202,7 +215,7 @@
           <w:b/>
           <w:sz w:val="21"/>
         </w:rPr>
-        <w:t>景点：威海国际海水浴场(5小时) - 火炬八街(1小时)</w:t>
+        <w:t>景点：火炬八街(0.5小时) - 威海国际海水浴场(6小时)</w:t>
       </w:r>
     </w:p>
     <w:p>
@@ -215,7 +228,7 @@
           <w:b w:val="0"/>
           <w:sz w:val="21"/>
         </w:rPr>
-        <w:t>直接打车到威海国际海水浴场，玩到下午5点左右，打车到火炬八街，坡道直通大海的打卡地，看日落。晚餐在火炬八街附近或回酒店附近。</w:t>
+        <w:t>直接打车到火炬八街，坡道直通大海的打卡地。然后步行到海边，威海国际海水浴场一直玩到日落，夜晚可能还有海滩乐队演出。两餐都在沙滩附近，还可以去店里打包到沙滩上吃。</w:t>
       </w:r>
     </w:p>
     <w:p>
@@ -358,6 +371,19 @@
     </w:p>
     <w:p>
       <w:pPr>
+        <w:spacing w:after="80" w:lineRule="auto" w:line="300"/>
+      </w:pPr>
+      <w:r>
+        <w:rPr>
+          <w:rFonts w:ascii="Helvetica Neue" w:hAnsi="Helvetica Neue" w:eastAsia="PingFang SC"/>
+          <w:b/>
+          <w:sz w:val="21"/>
+        </w:rPr>
+        <w:t>景点：环翠楼公园(1.5小时)</w:t>
+      </w:r>
+    </w:p>
+    <w:p>
+      <w:pPr>
         <w:spacing w:after="120" w:lineRule="auto" w:line="300"/>
       </w:pPr>
       <w:r>
@@ -366,7 +392,7 @@
           <w:b w:val="0"/>
           <w:sz w:val="21"/>
         </w:rPr>
-        <w:t>上午酒店周边随意闲逛，午餐后不安排游玩，直接回酒店拿行李返程。</w:t>
+        <w:t>上午酒店周边随意闲逛，可以去环翠楼感受下本地市井生活。午餐后不安排游玩，直接回酒店拿行李返程。</w:t>
       </w:r>
     </w:p>
     <w:p/>
@@ -459,7 +485,7 @@
           <w:b w:val="0"/>
           <w:sz w:val="21"/>
         </w:rPr>
-        <w:t>9月1日开海，大船9月5日起陆续返港，渔获量增价格回落，正是吃海鲜好时机；优先渔港或海鲜市场现买现加工</w:t>
+        <w:t>9月1日开海，海鲜正肥</w:t>
       </w:r>
     </w:p>
     <w:p>
@@ -474,7 +500,7 @@
           <w:b w:val="0"/>
           <w:sz w:val="21"/>
         </w:rPr>
-        <w:t>带小朋友玩海：防晒（帽子+防晒衣）、挖沙工具、涉水鞋、浮圈</w:t>
+        <w:t>带小朋友玩海：防晒（帽子+防晒衣）、挖沙工具、游泳装备，礁石滩赶海还需要防滑鞋</w:t>
       </w:r>
     </w:p>
     <w:p>
@@ -504,7 +530,7 @@
           <w:b w:val="0"/>
           <w:sz w:val="21"/>
         </w:rPr>
-        <w:t>猫头山+葡萄滩用环海路观光巴士串联：一票制，半月湾环线17站（含三号/六号/十号观景台、观景步道、葡萄滩站），各观景台均可随上随下；4-10月运营，出发前确认班次；旺季私家车禁行上山，另有一种景区观光车（20元当日无限次）仅串猫头山观景台，有观光巴士则不必重复购买</w:t>
+        <w:t>猫头山+葡萄滩用环海路观光巴士串联：一票制，半月湾环线17站（含三号/十号观景台、观景步道、葡萄滩站），各站均可随上随下；4-10月运营，出发前确认班次；旺季私家车禁行上山，另有一种景区观光车（20元当日无限次）仅串猫头山观景台，有观光巴士则不必重复购买</w:t>
       </w:r>
     </w:p>
     <w:p/>
@@ -592,7 +618,7 @@
           <w:b w:val="0"/>
           <w:sz w:val="21"/>
         </w:rPr>
-        <w:t>☐ 半月湾风景区 (环翠区 / 东北 / 5.9km / 18min)</w:t>
+        <w:t>☑ 半月湾风景区 (环翠区 / 东北 / 5.9km / 18min)</w:t>
       </w:r>
     </w:p>
     <w:p>
@@ -695,7 +721,7 @@
           <w:b w:val="0"/>
           <w:sz w:val="21"/>
         </w:rPr>
-        <w:t>☑ 海滨生态公园 (环翠区 / 东南 / 2.9km / 9min)</w:t>
+        <w:t>☑ 幸福公园 (环翠区 / 东南 / 2.6km / 12min)</w:t>
       </w:r>
     </w:p>
     <w:p>
@@ -725,22 +751,7 @@
           <w:b w:val="0"/>
           <w:sz w:val="21"/>
         </w:rPr>
-        <w:t>☑ 幸福门 (环翠区 / 东南 / 2.6km / 12min)</w:t>
-      </w:r>
-    </w:p>
-    <w:p>
-      <w:pPr>
-        <w:pStyle w:val="ListBullet"/>
-        <w:spacing w:after="60"/>
-        <w:ind w:left="340"/>
-      </w:pPr>
-      <w:r>
-        <w:rPr>
-          <w:rFonts w:ascii="Helvetica Neue" w:hAnsi="Helvetica Neue" w:eastAsia="PingFang SC"/>
-          <w:b w:val="0"/>
-          <w:sz w:val="21"/>
-        </w:rPr>
-        <w:t>☐ 环翠楼公园 (环翠区 / 西南 / 2.4km / 9min)</w:t>
+        <w:t>☑ 环翠楼公园 (环翠区 / 西南 / 2.4km / 9min)</w:t>
       </w:r>
     </w:p>
     <w:p>
@@ -871,7 +882,7 @@
           <w:b w:val="0"/>
           <w:sz w:val="21"/>
         </w:rPr>
-        <w:t>☑ 刘公岛景区 (环翠区 / 湾口 / 轮渡 / 半天以上)</w:t>
+        <w:t>☑ 刘公岛景区 (环翠区 / 东 / 9.3km / 1h)</w:t>
       </w:r>
     </w:p>
     <w:p>

</xml_diff>